<commit_message>
Improve resume certification layout
</commit_message>
<xml_diff>
--- a/Jack-Cournoyer-Resume.docx
+++ b/Jack-Cournoyer-Resume.docx
@@ -4,14 +4,14 @@
   <w:body>
     <w:p>
       <w:pPr>
-        <w:spacing w:before="0" w:after="20" w:line="240" w:lineRule="auto"/>
+        <w:spacing w:before="0" w:after="40" w:line="240" w:lineRule="auto"/>
         <w:jc w:val="center"/>
       </w:pPr>
       <w:r>
         <w:rPr>
           <w:rFonts w:ascii="Arial" w:hAnsi="Arial"/>
           <w:b/>
-          <w:sz w:val="38"/>
+          <w:sz w:val="40"/>
         </w:rPr>
         <w:t>Jack Cournoyer</w:t>
       </w:r>
@@ -25,32 +25,152 @@
         <w:rPr>
           <w:rFonts w:ascii="Arial" w:hAnsi="Arial"/>
           <w:b w:val="0"/>
-          <w:sz w:val="18"/>
+          <w:sz w:val="19"/>
         </w:rPr>
         <w:t>Sarasota, FL | (941) 961-4531 | John.Cournoyer.104@gmail.com</w:t>
       </w:r>
     </w:p>
     <w:p>
       <w:pPr>
-        <w:spacing w:before="0" w:after="80" w:line="240" w:lineRule="auto"/>
+        <w:spacing w:before="0" w:after="100" w:line="240" w:lineRule="auto"/>
         <w:jc w:val="center"/>
       </w:pPr>
       <w:r>
         <w:rPr>
           <w:rFonts w:ascii="Arial" w:hAnsi="Arial"/>
           <w:b w:val="0"/>
-          <w:sz w:val="18"/>
+          <w:sz w:val="19"/>
         </w:rPr>
         <w:t>linkedin.com/in/john-cournoyer | github.com/Jackjack104/Data-Portfolio</w:t>
       </w:r>
     </w:p>
     <w:p>
       <w:pPr>
-        <w:spacing w:before="100" w:after="20" w:line="240" w:lineRule="auto"/>
-        <w:jc w:val="left"/>
+        <w:spacing w:before="140" w:after="40" w:line="240" w:lineRule="auto"/>
         <w:pBdr>
-          <w:bottom w:val="single" w:sz="6" w:space="1" w:color="808080"/>
+          <w:bottom w:val="single" w:sz="6" w:space="2" w:color="808080"/>
         </w:pBdr>
+      </w:pPr>
+      <w:r>
+        <w:rPr>
+          <w:rFonts w:ascii="Arial" w:hAnsi="Arial"/>
+          <w:b/>
+          <w:sz w:val="22"/>
+        </w:rPr>
+        <w:t>SENIOR DATA ANALYST | SALES ANALYTICS | CRM DATA ARCHITECTURE | BUSINESS INTELLIGENCE</w:t>
+      </w:r>
+    </w:p>
+    <w:p>
+      <w:pPr>
+        <w:spacing w:before="20" w:after="60" w:line="250" w:lineRule="auto"/>
+      </w:pPr>
+      <w:r>
+        <w:rPr>
+          <w:rFonts w:ascii="Arial" w:hAnsi="Arial"/>
+          <w:b w:val="0"/>
+          <w:sz w:val="20"/>
+        </w:rPr>
+        <w:t>Senior Data Analyst with 3+ years of experience building reliable reporting, data models, and analytical workflows for sales and operations teams. Specializes in CRM data quality, PostgreSQL, Python, Power BI, and business-process improvement to turn complex data into practical decisions.</w:t>
+      </w:r>
+    </w:p>
+    <w:p>
+      <w:pPr>
+        <w:spacing w:before="140" w:after="40" w:line="240" w:lineRule="auto"/>
+        <w:pBdr>
+          <w:bottom w:val="single" w:sz="6" w:space="2" w:color="808080"/>
+        </w:pBdr>
+      </w:pPr>
+      <w:r>
+        <w:rPr>
+          <w:rFonts w:ascii="Arial" w:hAnsi="Arial"/>
+          <w:b/>
+          <w:sz w:val="22"/>
+        </w:rPr>
+        <w:t>TECHNICAL SKILLS</w:t>
+      </w:r>
+    </w:p>
+    <w:p>
+      <w:pPr>
+        <w:spacing w:before="0" w:after="20" w:line="245" w:lineRule="auto"/>
+      </w:pPr>
+      <w:r>
+        <w:rPr>
+          <w:rFonts w:ascii="Arial" w:hAnsi="Arial"/>
+          <w:b/>
+          <w:sz w:val="19"/>
+        </w:rPr>
+        <w:t xml:space="preserve">Analytics &amp; BI: </w:t>
+      </w:r>
+      <w:r>
+        <w:rPr>
+          <w:rFonts w:ascii="Arial" w:hAnsi="Arial"/>
+          <w:b w:val="0"/>
+          <w:sz w:val="19"/>
+        </w:rPr>
+        <w:t>Power BI, DAX, KPI Design, Dashboard Development, Customer Retention Analysis, Data Storytelling</w:t>
+      </w:r>
+    </w:p>
+    <w:p>
+      <w:pPr>
+        <w:spacing w:before="0" w:after="20" w:line="245" w:lineRule="auto"/>
+      </w:pPr>
+      <w:r>
+        <w:rPr>
+          <w:rFonts w:ascii="Arial" w:hAnsi="Arial"/>
+          <w:b/>
+          <w:sz w:val="19"/>
+        </w:rPr>
+        <w:t xml:space="preserve">Data &amp; Engineering: </w:t>
+      </w:r>
+      <w:r>
+        <w:rPr>
+          <w:rFonts w:ascii="Arial" w:hAnsi="Arial"/>
+          <w:b w:val="0"/>
+          <w:sz w:val="19"/>
+        </w:rPr>
+        <w:t>SQL, PostgreSQL, Python, Pandas, dbt, Docker, ETL/ELT, Dimensional Modeling, Data Quality</w:t>
+      </w:r>
+    </w:p>
+    <w:p>
+      <w:pPr>
+        <w:spacing w:before="0" w:after="20" w:line="245" w:lineRule="auto"/>
+      </w:pPr>
+      <w:r>
+        <w:rPr>
+          <w:rFonts w:ascii="Arial" w:hAnsi="Arial"/>
+          <w:b/>
+          <w:sz w:val="19"/>
+        </w:rPr>
+        <w:t xml:space="preserve">Business Systems &amp; Tools: </w:t>
+      </w:r>
+      <w:r>
+        <w:rPr>
+          <w:rFonts w:ascii="Arial" w:hAnsi="Arial"/>
+          <w:b w:val="0"/>
+          <w:sz w:val="19"/>
+        </w:rPr>
+        <w:t>HubSpot, Oracle NetSuite, AWS, Excel, Google Sheets, Git/GitHub, VS Code, AI-Assisted Analytics</w:t>
+      </w:r>
+    </w:p>
+    <w:p>
+      <w:pPr>
+        <w:spacing w:before="140" w:after="40" w:line="240" w:lineRule="auto"/>
+        <w:pBdr>
+          <w:bottom w:val="single" w:sz="6" w:space="2" w:color="808080"/>
+        </w:pBdr>
+      </w:pPr>
+      <w:r>
+        <w:rPr>
+          <w:rFonts w:ascii="Arial" w:hAnsi="Arial"/>
+          <w:b/>
+          <w:sz w:val="22"/>
+        </w:rPr>
+        <w:t>PROFESSIONAL EXPERIENCE</w:t>
+      </w:r>
+    </w:p>
+    <w:p>
+      <w:pPr>
+        <w:spacing w:before="60" w:after="20" w:line="240" w:lineRule="auto"/>
       </w:pPr>
       <w:r>
         <w:rPr>
@@ -58,12 +178,22 @@
           <w:b/>
           <w:sz w:val="20"/>
         </w:rPr>
-        <w:t>SENIOR DATA ANALYST | SALES ANALYTICS | CRM DATA ARCHITECTURE | BUSINESS INTELLIGENCE</w:t>
+        <w:t>Senior Data Analyst | PropLogix</w:t>
+      </w:r>
+      <w:r>
+        <w:rPr>
+          <w:rFonts w:ascii="Arial" w:hAnsi="Arial"/>
+          <w:b w:val="0"/>
+          <w:sz w:val="20"/>
+        </w:rPr>
+        <w:t xml:space="preserve"> | Sarasota, FL | Nov 2022 - Present</w:t>
       </w:r>
     </w:p>
     <w:p>
       <w:pPr>
-        <w:spacing w:before="20" w:after="40" w:line="245" w:lineRule="auto"/>
+        <w:pStyle w:val="ListBullet"/>
+        <w:spacing w:before="0" w:after="26" w:line="247" w:lineRule="auto"/>
+        <w:ind w:left="288" w:hanging="173"/>
       </w:pPr>
       <w:r>
         <w:rPr>
@@ -71,16 +201,72 @@
           <w:b w:val="0"/>
           <w:sz w:val="19"/>
         </w:rPr>
-        <w:t>Senior Data Analyst with 3+ years of experience building reliable reporting, data models, and analytical workflows for sales and operations teams. Specializes in CRM data quality, PostgreSQL, Python, Power BI, and business-process improvement to turn complex data into practical decisions.</w:t>
+        <w:t>Lead data governance initiatives that improved data integrity and reliability by 35%, strengthening executive reporting and decision-making.</w:t>
       </w:r>
     </w:p>
     <w:p>
       <w:pPr>
-        <w:spacing w:before="100" w:after="20" w:line="240" w:lineRule="auto"/>
-        <w:jc w:val="left"/>
-        <w:pBdr>
-          <w:bottom w:val="single" w:sz="6" w:space="1" w:color="808080"/>
-        </w:pBdr>
+        <w:pStyle w:val="ListBullet"/>
+        <w:spacing w:before="0" w:after="26" w:line="247" w:lineRule="auto"/>
+        <w:ind w:left="288" w:hanging="173"/>
+      </w:pPr>
+      <w:r>
+        <w:rPr>
+          <w:rFonts w:ascii="Arial" w:hAnsi="Arial"/>
+          <w:b w:val="0"/>
+          <w:sz w:val="19"/>
+        </w:rPr>
+        <w:t>Design scalable CRM and operational data models that connect business entities, standardize reporting logic, and increased analytics adoption by 50%.</w:t>
+      </w:r>
+    </w:p>
+    <w:p>
+      <w:pPr>
+        <w:pStyle w:val="ListBullet"/>
+        <w:spacing w:before="0" w:after="26" w:line="247" w:lineRule="auto"/>
+        <w:ind w:left="288" w:hanging="173"/>
+      </w:pPr>
+      <w:r>
+        <w:rPr>
+          <w:rFonts w:ascii="Arial" w:hAnsi="Arial"/>
+          <w:b w:val="0"/>
+          <w:sz w:val="19"/>
+        </w:rPr>
+        <w:t>Improve ETL processes and data-loading workflows by 20%, supporting more timely reporting and analysis across sales and operations.</w:t>
+      </w:r>
+    </w:p>
+    <w:p>
+      <w:pPr>
+        <w:pStyle w:val="ListBullet"/>
+        <w:spacing w:before="0" w:after="26" w:line="247" w:lineRule="auto"/>
+        <w:ind w:left="288" w:hanging="173"/>
+      </w:pPr>
+      <w:r>
+        <w:rPr>
+          <w:rFonts w:ascii="Arial" w:hAnsi="Arial"/>
+          <w:b w:val="0"/>
+          <w:sz w:val="19"/>
+        </w:rPr>
+        <w:t>Develop Power BI dashboards and SQL-based reporting that track KPIs, customer activity, sales performance, and operational trends.</w:t>
+      </w:r>
+    </w:p>
+    <w:p>
+      <w:pPr>
+        <w:pStyle w:val="ListBullet"/>
+        <w:spacing w:before="0" w:after="26" w:line="247" w:lineRule="auto"/>
+        <w:ind w:left="288" w:hanging="173"/>
+      </w:pPr>
+      <w:r>
+        <w:rPr>
+          <w:rFonts w:ascii="Arial" w:hAnsi="Arial"/>
+          <w:b w:val="0"/>
+          <w:sz w:val="19"/>
+        </w:rPr>
+        <w:t>Partner with executives and cross-functional teams to translate business questions into documented data requirements, metrics, and actionable recommendations.</w:t>
+      </w:r>
+    </w:p>
+    <w:p>
+      <w:pPr>
+        <w:spacing w:before="60" w:after="20" w:line="240" w:lineRule="auto"/>
       </w:pPr>
       <w:r>
         <w:rPr>
@@ -88,79 +274,50 @@
           <w:b/>
           <w:sz w:val="20"/>
         </w:rPr>
-        <w:t>TECHNICAL SKILLS</w:t>
-      </w:r>
-    </w:p>
-    <w:p>
-      <w:pPr>
-        <w:spacing w:before="0" w:after="0" w:line="240" w:lineRule="auto"/>
-      </w:pPr>
-      <w:r>
-        <w:rPr>
-          <w:rFonts w:ascii="Arial" w:hAnsi="Arial"/>
-          <w:b/>
-          <w:sz w:val="18"/>
-        </w:rPr>
-        <w:t xml:space="preserve">Analytics &amp; BI: </w:t>
+        <w:t>Senior Process Improvement Specialist | PropLogix</w:t>
       </w:r>
       <w:r>
         <w:rPr>
           <w:rFonts w:ascii="Arial" w:hAnsi="Arial"/>
           <w:b w:val="0"/>
-          <w:sz w:val="18"/>
+          <w:sz w:val="20"/>
         </w:rPr>
-        <w:t>Power BI, DAX, KPI Design, Dashboard Development, Customer Retention Analysis, Data Storytelling</w:t>
+        <w:t xml:space="preserve"> | Sarasota, FL | Jan 2022 - Nov 2022</w:t>
       </w:r>
     </w:p>
     <w:p>
       <w:pPr>
-        <w:spacing w:before="0" w:after="0" w:line="240" w:lineRule="auto"/>
+        <w:pStyle w:val="ListBullet"/>
+        <w:spacing w:before="0" w:after="26" w:line="247" w:lineRule="auto"/>
+        <w:ind w:left="288" w:hanging="173"/>
       </w:pPr>
       <w:r>
         <w:rPr>
           <w:rFonts w:ascii="Arial" w:hAnsi="Arial"/>
-          <w:b/>
-          <w:sz w:val="18"/>
+          <w:b w:val="0"/>
+          <w:sz w:val="19"/>
         </w:rPr>
-        <w:t xml:space="preserve">Data &amp; Engineering: </w:t>
+        <w:t>Led the migration and consolidation of customer-support platforms, bringing multiple customer-facing teams onto a unified operating model.</w:t>
       </w:r>
+    </w:p>
+    <w:p>
+      <w:pPr>
+        <w:pStyle w:val="ListBullet"/>
+        <w:spacing w:before="0" w:after="26" w:line="247" w:lineRule="auto"/>
+        <w:ind w:left="288" w:hanging="173"/>
+      </w:pPr>
       <w:r>
         <w:rPr>
           <w:rFonts w:ascii="Arial" w:hAnsi="Arial"/>
           <w:b w:val="0"/>
-          <w:sz w:val="18"/>
+          <w:sz w:val="19"/>
         </w:rPr>
-        <w:t>SQL, PostgreSQL, Python, Pandas, dbt, Docker, ETL/ELT, Dimensional Modeling, Data Quality</w:t>
+        <w:t>Selected and implemented a performance-management platform that replaced a manual process, improving workflow efficiency and employee engagement.</w:t>
       </w:r>
     </w:p>
     <w:p>
       <w:pPr>
-        <w:spacing w:before="0" w:after="0" w:line="240" w:lineRule="auto"/>
-      </w:pPr>
-      <w:r>
-        <w:rPr>
-          <w:rFonts w:ascii="Arial" w:hAnsi="Arial"/>
-          <w:b/>
-          <w:sz w:val="18"/>
-        </w:rPr>
-        <w:t xml:space="preserve">Business Systems &amp; Tools: </w:t>
-      </w:r>
-      <w:r>
-        <w:rPr>
-          <w:rFonts w:ascii="Arial" w:hAnsi="Arial"/>
-          <w:b w:val="0"/>
-          <w:sz w:val="18"/>
-        </w:rPr>
-        <w:t>HubSpot, Oracle NetSuite, AWS, Excel, Google Sheets, Git/GitHub, VS Code, AI-Assisted Analytics</w:t>
-      </w:r>
-    </w:p>
-    <w:p>
-      <w:pPr>
-        <w:spacing w:before="100" w:after="20" w:line="240" w:lineRule="auto"/>
-        <w:jc w:val="left"/>
-        <w:pBdr>
-          <w:bottom w:val="single" w:sz="6" w:space="1" w:color="808080"/>
-        </w:pBdr>
+        <w:spacing w:before="60" w:after="20" w:line="240" w:lineRule="auto"/>
       </w:pPr>
       <w:r>
         <w:rPr>
@@ -168,12 +325,72 @@
           <w:b/>
           <w:sz w:val="20"/>
         </w:rPr>
-        <w:t>PROFESSIONAL EXPERIENCE</w:t>
+        <w:t>Operations Manager | PropLogix</w:t>
+      </w:r>
+      <w:r>
+        <w:rPr>
+          <w:rFonts w:ascii="Arial" w:hAnsi="Arial"/>
+          <w:b w:val="0"/>
+          <w:sz w:val="20"/>
+        </w:rPr>
+        <w:t xml:space="preserve"> | Sarasota, FL | Jan 2019 - Dec 2021</w:t>
       </w:r>
     </w:p>
     <w:p>
       <w:pPr>
-        <w:spacing w:before="40" w:after="0" w:line="240" w:lineRule="auto"/>
+        <w:pStyle w:val="ListBullet"/>
+        <w:spacing w:before="0" w:after="26" w:line="247" w:lineRule="auto"/>
+        <w:ind w:left="288" w:hanging="173"/>
+      </w:pPr>
+      <w:r>
+        <w:rPr>
+          <w:rFonts w:ascii="Arial" w:hAnsi="Arial"/>
+          <w:b w:val="0"/>
+          <w:sz w:val="19"/>
+        </w:rPr>
+        <w:t>Managed a cross-functional team and led the go-to-market launch of a real-estate due-diligence product that generated $1M in growth revenue in its first year.</w:t>
+      </w:r>
+    </w:p>
+    <w:p>
+      <w:pPr>
+        <w:spacing w:before="140" w:after="40" w:line="240" w:lineRule="auto"/>
+        <w:pBdr>
+          <w:bottom w:val="single" w:sz="6" w:space="2" w:color="808080"/>
+        </w:pBdr>
+      </w:pPr>
+      <w:r>
+        <w:rPr>
+          <w:rFonts w:ascii="Arial" w:hAnsi="Arial"/>
+          <w:b/>
+          <w:sz w:val="22"/>
+        </w:rPr>
+        <w:t>EDUCATION &amp; CERTIFICATIONS</w:t>
+      </w:r>
+    </w:p>
+    <w:p>
+      <w:pPr>
+        <w:spacing w:before="40" w:after="20" w:line="240" w:lineRule="auto"/>
+      </w:pPr>
+      <w:r>
+        <w:rPr>
+          <w:rFonts w:ascii="Arial" w:hAnsi="Arial"/>
+          <w:b/>
+          <w:sz w:val="20"/>
+        </w:rPr>
+        <w:t>Bachelor of Science</w:t>
+      </w:r>
+      <w:r>
+        <w:rPr>
+          <w:rFonts w:ascii="Arial" w:hAnsi="Arial"/>
+          <w:b w:val="0"/>
+          <w:sz w:val="20"/>
+        </w:rPr>
+        <w:t xml:space="preserve"> | Florida State University, Tallahassee, FL</w:t>
+      </w:r>
+    </w:p>
+    <w:p>
+      <w:pPr>
+        <w:spacing w:before="0" w:after="28" w:line="240" w:lineRule="auto"/>
       </w:pPr>
       <w:r>
         <w:rPr>
@@ -181,7 +398,7 @@
           <w:b/>
           <w:sz w:val="19"/>
         </w:rPr>
-        <w:t>Senior Data Analyst | PropLogix</w:t>
+        <w:t>Lean Six Sigma Black Belt</w:t>
       </w:r>
       <w:r>
         <w:rPr>
@@ -189,87 +406,12 @@
           <w:b w:val="0"/>
           <w:sz w:val="19"/>
         </w:rPr>
-        <w:t xml:space="preserve"> | Sarasota, FL | Nov 2022 - Present</w:t>
+        <w:t xml:space="preserve"> | Aveta Business Institute</w:t>
       </w:r>
     </w:p>
     <w:p>
       <w:pPr>
-        <w:pStyle w:val="ListBullet"/>
-        <w:spacing w:before="0" w:after="0" w:line="240" w:lineRule="auto"/>
-        <w:ind w:left="274" w:hanging="173"/>
-      </w:pPr>
-      <w:r>
-        <w:rPr>
-          <w:rFonts w:ascii="Arial" w:hAnsi="Arial"/>
-          <w:b w:val="0"/>
-          <w:sz w:val="18"/>
-        </w:rPr>
-        <w:t>Lead data governance initiatives that improved data integrity and reliability by 35%, strengthening executive reporting and decision-making.</w:t>
-      </w:r>
-    </w:p>
-    <w:p>
-      <w:pPr>
-        <w:pStyle w:val="ListBullet"/>
-        <w:spacing w:before="0" w:after="0" w:line="240" w:lineRule="auto"/>
-        <w:ind w:left="274" w:hanging="173"/>
-      </w:pPr>
-      <w:r>
-        <w:rPr>
-          <w:rFonts w:ascii="Arial" w:hAnsi="Arial"/>
-          <w:b w:val="0"/>
-          <w:sz w:val="18"/>
-        </w:rPr>
-        <w:t>Design scalable CRM and operational data models that connect business entities, standardize reporting logic, and increased analytics adoption by 50%.</w:t>
-      </w:r>
-    </w:p>
-    <w:p>
-      <w:pPr>
-        <w:pStyle w:val="ListBullet"/>
-        <w:spacing w:before="0" w:after="0" w:line="240" w:lineRule="auto"/>
-        <w:ind w:left="274" w:hanging="173"/>
-      </w:pPr>
-      <w:r>
-        <w:rPr>
-          <w:rFonts w:ascii="Arial" w:hAnsi="Arial"/>
-          <w:b w:val="0"/>
-          <w:sz w:val="18"/>
-        </w:rPr>
-        <w:t>Improve ETL processes and data-loading workflows by 20%, supporting more timely reporting and analysis across sales and operations.</w:t>
-      </w:r>
-    </w:p>
-    <w:p>
-      <w:pPr>
-        <w:pStyle w:val="ListBullet"/>
-        <w:spacing w:before="0" w:after="0" w:line="240" w:lineRule="auto"/>
-        <w:ind w:left="274" w:hanging="173"/>
-      </w:pPr>
-      <w:r>
-        <w:rPr>
-          <w:rFonts w:ascii="Arial" w:hAnsi="Arial"/>
-          <w:b w:val="0"/>
-          <w:sz w:val="18"/>
-        </w:rPr>
-        <w:t>Develop Power BI dashboards and SQL-based reporting that track KPIs, customer activity, sales performance, and operational trends.</w:t>
-      </w:r>
-    </w:p>
-    <w:p>
-      <w:pPr>
-        <w:pStyle w:val="ListBullet"/>
-        <w:spacing w:before="0" w:after="0" w:line="240" w:lineRule="auto"/>
-        <w:ind w:left="274" w:hanging="173"/>
-      </w:pPr>
-      <w:r>
-        <w:rPr>
-          <w:rFonts w:ascii="Arial" w:hAnsi="Arial"/>
-          <w:b w:val="0"/>
-          <w:sz w:val="18"/>
-        </w:rPr>
-        <w:t>Partner with executives and cross-functional teams to translate business questions into documented data requirements, metrics, and actionable recommendations.</w:t>
-      </w:r>
-    </w:p>
-    <w:p>
-      <w:pPr>
-        <w:spacing w:before="40" w:after="0" w:line="240" w:lineRule="auto"/>
+        <w:spacing w:before="0" w:after="28" w:line="240" w:lineRule="auto"/>
       </w:pPr>
       <w:r>
         <w:rPr>
@@ -277,7 +419,7 @@
           <w:b/>
           <w:sz w:val="19"/>
         </w:rPr>
-        <w:t>Senior Process Improvement Specialist | PropLogix</w:t>
+        <w:t>Data Privacy Fundamentals</w:t>
       </w:r>
       <w:r>
         <w:rPr>
@@ -285,42 +427,12 @@
           <w:b w:val="0"/>
           <w:sz w:val="19"/>
         </w:rPr>
-        <w:t xml:space="preserve"> | Sarasota, FL | Jan 2022 - Nov 2022</w:t>
+        <w:t xml:space="preserve"> | Northeastern University</w:t>
       </w:r>
     </w:p>
     <w:p>
       <w:pPr>
-        <w:pStyle w:val="ListBullet"/>
-        <w:spacing w:before="0" w:after="0" w:line="240" w:lineRule="auto"/>
-        <w:ind w:left="274" w:hanging="173"/>
-      </w:pPr>
-      <w:r>
-        <w:rPr>
-          <w:rFonts w:ascii="Arial" w:hAnsi="Arial"/>
-          <w:b w:val="0"/>
-          <w:sz w:val="18"/>
-        </w:rPr>
-        <w:t>Led the migration and consolidation of customer-support platforms, bringing multiple customer-facing teams onto a unified operating model.</w:t>
-      </w:r>
-    </w:p>
-    <w:p>
-      <w:pPr>
-        <w:pStyle w:val="ListBullet"/>
-        <w:spacing w:before="0" w:after="0" w:line="240" w:lineRule="auto"/>
-        <w:ind w:left="274" w:hanging="173"/>
-      </w:pPr>
-      <w:r>
-        <w:rPr>
-          <w:rFonts w:ascii="Arial" w:hAnsi="Arial"/>
-          <w:b w:val="0"/>
-          <w:sz w:val="18"/>
-        </w:rPr>
-        <w:t>Selected and implemented a performance-management platform that replaced a manual process, improving workflow efficiency and employee engagement.</w:t>
-      </w:r>
-    </w:p>
-    <w:p>
-      <w:pPr>
-        <w:spacing w:before="40" w:after="0" w:line="240" w:lineRule="auto"/>
+        <w:spacing w:before="0" w:after="28" w:line="240" w:lineRule="auto"/>
       </w:pPr>
       <w:r>
         <w:rPr>
@@ -328,7 +440,7 @@
           <w:b/>
           <w:sz w:val="19"/>
         </w:rPr>
-        <w:t>Operations Manager | PropLogix</w:t>
+        <w:t>Corporate Strategy</w:t>
       </w:r>
       <w:r>
         <w:rPr>
@@ -336,86 +448,33 @@
           <w:b w:val="0"/>
           <w:sz w:val="19"/>
         </w:rPr>
-        <w:t xml:space="preserve"> | Sarasota, FL | Jan 2019 - Dec 2021</w:t>
+        <w:t xml:space="preserve"> | University of London</w:t>
       </w:r>
     </w:p>
     <w:p>
       <w:pPr>
-        <w:pStyle w:val="ListBullet"/>
-        <w:spacing w:before="0" w:after="0" w:line="240" w:lineRule="auto"/>
-        <w:ind w:left="274" w:hanging="173"/>
-      </w:pPr>
-      <w:r>
-        <w:rPr>
-          <w:rFonts w:ascii="Arial" w:hAnsi="Arial"/>
-          <w:b w:val="0"/>
-          <w:sz w:val="18"/>
-        </w:rPr>
-        <w:t>Managed a cross-functional team and led the go-to-market launch of a real-estate due-diligence product that generated $1M in growth revenue in its first year.</w:t>
-      </w:r>
-    </w:p>
-    <w:p>
-      <w:pPr>
-        <w:spacing w:before="100" w:after="20" w:line="240" w:lineRule="auto"/>
-        <w:jc w:val="left"/>
-        <w:pBdr>
-          <w:bottom w:val="single" w:sz="6" w:space="1" w:color="808080"/>
-        </w:pBdr>
+        <w:spacing w:before="0" w:after="28" w:line="240" w:lineRule="auto"/>
       </w:pPr>
       <w:r>
         <w:rPr>
           <w:rFonts w:ascii="Arial" w:hAnsi="Arial"/>
           <w:b/>
-          <w:sz w:val="20"/>
+          <w:sz w:val="19"/>
         </w:rPr>
-        <w:t>EDUCATION &amp; CERTIFICATIONS</w:t>
-      </w:r>
-    </w:p>
-    <w:p>
-      <w:pPr>
-        <w:spacing w:before="20" w:after="0" w:line="240" w:lineRule="auto"/>
-      </w:pPr>
-      <w:r>
-        <w:rPr>
-          <w:rFonts w:ascii="Arial" w:hAnsi="Arial"/>
-          <w:b/>
-          <w:sz w:val="18"/>
-        </w:rPr>
-        <w:t>Bachelor of Science</w:t>
+        <w:t>HubSpot Data Reporting, Service Hub, and Sales Hub Software</w:t>
       </w:r>
       <w:r>
         <w:rPr>
           <w:rFonts w:ascii="Arial" w:hAnsi="Arial"/>
           <w:b w:val="0"/>
-          <w:sz w:val="18"/>
+          <w:sz w:val="19"/>
         </w:rPr>
-        <w:t xml:space="preserve"> | Florida State University, Tallahassee, FL</w:t>
-      </w:r>
-    </w:p>
-    <w:p>
-      <w:pPr>
-        <w:spacing w:before="20" w:after="0" w:line="240" w:lineRule="auto"/>
-      </w:pPr>
-      <w:r>
-        <w:rPr>
-          <w:rFonts w:ascii="Arial" w:hAnsi="Arial"/>
-          <w:b/>
-          <w:sz w:val="18"/>
-        </w:rPr>
-        <w:t xml:space="preserve">Certifications: </w:t>
-      </w:r>
-      <w:r>
-        <w:rPr>
-          <w:rFonts w:ascii="Arial" w:hAnsi="Arial"/>
-          <w:b w:val="0"/>
-          <w:sz w:val="18"/>
-        </w:rPr>
-        <w:t>Lean Six Sigma Black Belt (Aveta Business Institute) | Data Privacy Fundamentals (Northeastern University) | Corporate Strategy (University of London) | HubSpot Data Reporting, Service Hub, and Sales Hub Software</w:t>
+        <w:t xml:space="preserve"> | HubSpot Academy</w:t>
       </w:r>
     </w:p>
     <w:sectPr>
       <w:pgSz w:w="12240" w:h="15840"/>
-      <w:pgMar w:top="605" w:right="806" w:bottom="605" w:left="806" w:header="720" w:footer="720" w:gutter="0"/>
+      <w:pgMar w:top="835" w:right="936" w:bottom="835" w:left="936" w:header="720" w:footer="720" w:gutter="0"/>
       <w:cols w:space="720"/>
       <w:docGrid w:linePitch="360"/>
     </w:sectPr>
@@ -786,10 +845,6 @@
     <w:name w:val="Normal"/>
     <w:qFormat/>
     <w:rsid w:val="00FC693F"/>
-    <w:rPr>
-      <w:rFonts w:ascii="Arial" w:hAnsi="Arial"/>
-      <w:sz w:val="19"/>
-    </w:rPr>
   </w:style>
   <w:style w:type="paragraph" w:styleId="Header">
     <w:name w:val="header"/>

</xml_diff>

<commit_message>
Strengthen resume experience and projects
</commit_message>
<xml_diff>
--- a/Jack-Cournoyer-Resume.docx
+++ b/Jack-Cournoyer-Resume.docx
@@ -67,10 +67,9 @@
       <w:r>
         <w:rPr>
           <w:rFonts w:ascii="Arial" w:hAnsi="Arial"/>
-          <w:b w:val="0"/>
           <w:sz w:val="20"/>
         </w:rPr>
-        <w:t>Senior Data Analyst with 3+ years of experience building reliable reporting, data models, and analytical workflows for sales and operations teams. Specializes in CRM data quality, PostgreSQL, Python, Power BI, and business-process improvement to turn complex data into practical decisions.</w:t>
+        <w:t>Senior Data Analyst with five years of experience building reliable reporting, data models, and analytical workflows for sales and operations teams. Specializes in CRM data quality, PostgreSQL, Python, Power BI, and business-process improvement to turn complex data into practical decisions.</w:t>
       </w:r>
     </w:p>
     <w:p>
@@ -472,6 +471,109 @@
         <w:t xml:space="preserve"> | HubSpot Academy</w:t>
       </w:r>
     </w:p>
+    <w:p>
+      <w:pPr>
+        <w:spacing w:before="140" w:after="40" w:line="240" w:lineRule="auto"/>
+        <w:pBdr>
+          <w:bottom w:val="single" w:sz="6" w:space="2" w:color="808080"/>
+        </w:pBdr>
+      </w:pPr>
+      <w:r>
+        <w:rPr>
+          <w:rFonts w:ascii="Arial" w:hAnsi="Arial"/>
+          <w:b/>
+          <w:sz w:val="22"/>
+        </w:rPr>
+        <w:t>SELECTED PROJECTS</w:t>
+      </w:r>
+    </w:p>
+    <w:p>
+      <w:pPr>
+        <w:spacing w:before="20" w:after="30" w:line="245" w:lineRule="auto"/>
+      </w:pPr>
+      <w:r>
+        <w:rPr>
+          <w:rFonts w:ascii="Arial" w:hAnsi="Arial"/>
+          <w:b/>
+          <w:sz w:val="19"/>
+        </w:rPr>
+        <w:t>Sales &amp; CRM Analytics Pipeline</w:t>
+      </w:r>
+      <w:r>
+        <w:rPr>
+          <w:rFonts w:ascii="Arial" w:hAnsi="Arial"/>
+          <w:b w:val="0"/>
+          <w:sz w:val="19"/>
+        </w:rPr>
+        <w:t xml:space="preserve"> | Python, PostgreSQL, dbt, Docker: </w:t>
+      </w:r>
+      <w:r>
+        <w:rPr>
+          <w:rFonts w:ascii="Arial" w:hAnsi="Arial"/>
+          <w:b w:val="0"/>
+          <w:sz w:val="19"/>
+        </w:rPr>
+        <w:t>Built a documented local pipeline that generates synthetic CRM and ERP data, loads PostgreSQL models, and publishes tested customer, sales, and data-quality marts.</w:t>
+      </w:r>
+    </w:p>
+    <w:p>
+      <w:pPr>
+        <w:spacing w:before="20" w:after="30" w:line="245" w:lineRule="auto"/>
+      </w:pPr>
+      <w:r>
+        <w:rPr>
+          <w:rFonts w:ascii="Arial" w:hAnsi="Arial"/>
+          <w:b/>
+          <w:sz w:val="19"/>
+        </w:rPr>
+        <w:t>Customer Retention Analytics</w:t>
+      </w:r>
+      <w:r>
+        <w:rPr>
+          <w:rFonts w:ascii="Arial" w:hAnsi="Arial"/>
+          <w:b w:val="0"/>
+          <w:sz w:val="19"/>
+        </w:rPr>
+        <w:t xml:space="preserve"> | SQL, Python, Power BI: </w:t>
+      </w:r>
+      <w:r>
+        <w:rPr>
+          <w:rFonts w:ascii="Arial" w:hAnsi="Arial"/>
+          <w:b w:val="0"/>
+          <w:sz w:val="19"/>
+        </w:rPr>
+        <w:t>Modeled acquisition cohorts and customer lifecycle states to identify drop-off points and support retention monitoring across analytics platforms.</w:t>
+      </w:r>
+    </w:p>
+    <w:p>
+      <w:pPr>
+        <w:spacing w:before="20" w:after="30" w:line="245" w:lineRule="auto"/>
+      </w:pPr>
+      <w:r>
+        <w:rPr>
+          <w:rFonts w:ascii="Arial" w:hAnsi="Arial"/>
+          <w:b/>
+          <w:sz w:val="19"/>
+        </w:rPr>
+        <w:t>Sales Performance &amp; Territory Analytics</w:t>
+      </w:r>
+      <w:r>
+        <w:rPr>
+          <w:rFonts w:ascii="Arial" w:hAnsi="Arial"/>
+          <w:b w:val="0"/>
+          <w:sz w:val="19"/>
+        </w:rPr>
+        <w:t xml:space="preserve"> | Power BI, DAX, SQL: </w:t>
+      </w:r>
+      <w:r>
+        <w:rPr>
+          <w:rFonts w:ascii="Arial" w:hAnsi="Arial"/>
+          <w:b w:val="0"/>
+          <w:sz w:val="19"/>
+        </w:rPr>
+        <w:t>Built a sales reporting model for YTD results, territory performance, customer investigation, and executive KPI review.</w:t>
+      </w:r>
+    </w:p>
     <w:sectPr>
       <w:pgSz w:w="12240" w:h="15840"/>
       <w:pgMar w:top="835" w:right="936" w:bottom="835" w:left="936" w:header="720" w:footer="720" w:gutter="0"/>

</xml_diff>

<commit_message>
Polish resume project links and headline
</commit_message>
<xml_diff>
--- a/Jack-Cournoyer-Resume.docx
+++ b/Jack-Cournoyer-Resume.docx
@@ -50,12 +50,13 @@
         <w:pBdr>
           <w:bottom w:val="single" w:sz="6" w:space="2" w:color="808080"/>
         </w:pBdr>
+        <w:jc w:val="left"/>
       </w:pPr>
       <w:r>
         <w:rPr>
           <w:rFonts w:ascii="Arial" w:hAnsi="Arial"/>
           <w:b/>
-          <w:sz w:val="22"/>
+          <w:sz w:val="18"/>
         </w:rPr>
         <w:t>SENIOR DATA ANALYST | SALES ANALYTICS | CRM DATA ARCHITECTURE | BUSINESS INTELLIGENCE</w:t>
       </w:r>
@@ -473,7 +474,7 @@
     </w:p>
     <w:p>
       <w:pPr>
-        <w:spacing w:before="140" w:after="40" w:line="240" w:lineRule="auto"/>
+        <w:spacing w:before="120" w:after="20" w:line="240" w:lineRule="auto"/>
         <w:pBdr>
           <w:bottom w:val="single" w:sz="6" w:space="2" w:color="808080"/>
         </w:pBdr>
@@ -482,96 +483,180 @@
         <w:rPr>
           <w:rFonts w:ascii="Arial" w:hAnsi="Arial"/>
           <w:b/>
-          <w:sz w:val="22"/>
+          <w:sz w:val="21"/>
         </w:rPr>
         <w:t>SELECTED PROJECTS</w:t>
       </w:r>
     </w:p>
     <w:p>
       <w:pPr>
-        <w:spacing w:before="20" w:after="30" w:line="245" w:lineRule="auto"/>
+        <w:spacing w:before="40" w:after="0" w:line="240" w:lineRule="auto"/>
       </w:pPr>
-      <w:r>
-        <w:rPr>
-          <w:rFonts w:ascii="Arial" w:hAnsi="Arial"/>
-          <w:b/>
-          <w:sz w:val="19"/>
-        </w:rPr>
-        <w:t>Sales &amp; CRM Analytics Pipeline</w:t>
-      </w:r>
+      <w:hyperlink r:id="rId9">
+        <w:r>
+          <w:rPr>
+            <w:color w:val="0563C1"/>
+            <w:u w:val="single"/>
+            <w:rFonts w:ascii="Arial" w:hAnsi="Arial"/>
+            <w:sz w:val="20"/>
+            <w:b/>
+          </w:rPr>
+          <w:t>Sales &amp; CRM Analytics Pipeline</w:t>
+        </w:r>
+      </w:hyperlink>
       <w:r>
         <w:rPr>
           <w:rFonts w:ascii="Arial" w:hAnsi="Arial"/>
           <w:b w:val="0"/>
           <w:sz w:val="19"/>
         </w:rPr>
-        <w:t xml:space="preserve"> | Python, PostgreSQL, dbt, Docker: </w:t>
+        <w:t xml:space="preserve">  |  </w:t>
       </w:r>
+      <w:hyperlink r:id="rId9">
+        <w:r>
+          <w:rPr>
+            <w:color w:val="0563C1"/>
+            <w:u w:val="single"/>
+            <w:rFonts w:ascii="Arial" w:hAnsi="Arial"/>
+            <w:sz w:val="19"/>
+          </w:rPr>
+          <w:t>View project</w:t>
+        </w:r>
+      </w:hyperlink>
+    </w:p>
+    <w:p>
+      <w:pPr>
+        <w:spacing w:before="0" w:after="40" w:line="245" w:lineRule="auto"/>
+      </w:pPr>
+      <w:r>
+        <w:rPr>
+          <w:rFonts w:ascii="Arial" w:hAnsi="Arial"/>
+          <w:b/>
+          <w:sz w:val="18"/>
+        </w:rPr>
+        <w:t>Python | PostgreSQL | dbt | Docker</w:t>
+      </w:r>
+      <w:r>
+        <w:rPr>
+          <w:rFonts w:ascii="Arial" w:hAnsi="Arial"/>
+          <w:b w:val="0"/>
+          <w:sz w:val="18"/>
+        </w:rPr>
+        <w:t xml:space="preserve">  |  Synthetic CRM and ERP pipeline with tested customer, sales, and data-quality marts.</w:t>
+      </w:r>
+    </w:p>
+    <w:p>
+      <w:pPr>
+        <w:spacing w:before="40" w:after="0" w:line="240" w:lineRule="auto"/>
+      </w:pPr>
+      <w:hyperlink r:id="rId10">
+        <w:r>
+          <w:rPr>
+            <w:color w:val="0563C1"/>
+            <w:u w:val="single"/>
+            <w:rFonts w:ascii="Arial" w:hAnsi="Arial"/>
+            <w:sz w:val="20"/>
+            <w:b/>
+          </w:rPr>
+          <w:t>Customer Retention Analytics</w:t>
+        </w:r>
+      </w:hyperlink>
       <w:r>
         <w:rPr>
           <w:rFonts w:ascii="Arial" w:hAnsi="Arial"/>
           <w:b w:val="0"/>
           <w:sz w:val="19"/>
         </w:rPr>
-        <w:t>Built a documented local pipeline that generates synthetic CRM and ERP data, loads PostgreSQL models, and publishes tested customer, sales, and data-quality marts.</w:t>
+        <w:t xml:space="preserve">  |  </w:t>
       </w:r>
+      <w:hyperlink r:id="rId10">
+        <w:r>
+          <w:rPr>
+            <w:color w:val="0563C1"/>
+            <w:u w:val="single"/>
+            <w:rFonts w:ascii="Arial" w:hAnsi="Arial"/>
+            <w:sz w:val="19"/>
+          </w:rPr>
+          <w:t>View project</w:t>
+        </w:r>
+      </w:hyperlink>
     </w:p>
     <w:p>
       <w:pPr>
-        <w:spacing w:before="20" w:after="30" w:line="245" w:lineRule="auto"/>
+        <w:spacing w:before="0" w:after="40" w:line="245" w:lineRule="auto"/>
       </w:pPr>
       <w:r>
         <w:rPr>
           <w:rFonts w:ascii="Arial" w:hAnsi="Arial"/>
           <w:b/>
-          <w:sz w:val="19"/>
+          <w:sz w:val="18"/>
         </w:rPr>
-        <w:t>Customer Retention Analytics</w:t>
+        <w:t>SQL | Python | Power BI</w:t>
       </w:r>
+      <w:r>
+        <w:rPr>
+          <w:rFonts w:ascii="Arial" w:hAnsi="Arial"/>
+          <w:b w:val="0"/>
+          <w:sz w:val="18"/>
+        </w:rPr>
+        <w:t xml:space="preserve">  |  Cohort and lifecycle analysis for customer drop-off and retention monitoring.</w:t>
+      </w:r>
+    </w:p>
+    <w:p>
+      <w:pPr>
+        <w:spacing w:before="40" w:after="0" w:line="240" w:lineRule="auto"/>
+      </w:pPr>
+      <w:hyperlink r:id="rId11">
+        <w:r>
+          <w:rPr>
+            <w:color w:val="0563C1"/>
+            <w:u w:val="single"/>
+            <w:rFonts w:ascii="Arial" w:hAnsi="Arial"/>
+            <w:sz w:val="20"/>
+            <w:b/>
+          </w:rPr>
+          <w:t>Sales Performance &amp; Territory Analytics</w:t>
+        </w:r>
+      </w:hyperlink>
       <w:r>
         <w:rPr>
           <w:rFonts w:ascii="Arial" w:hAnsi="Arial"/>
           <w:b w:val="0"/>
           <w:sz w:val="19"/>
         </w:rPr>
-        <w:t xml:space="preserve"> | SQL, Python, Power BI: </w:t>
+        <w:t xml:space="preserve">  |  </w:t>
+      </w:r>
+      <w:hyperlink r:id="rId11">
+        <w:r>
+          <w:rPr>
+            <w:color w:val="0563C1"/>
+            <w:u w:val="single"/>
+            <w:rFonts w:ascii="Arial" w:hAnsi="Arial"/>
+            <w:sz w:val="19"/>
+          </w:rPr>
+          <w:t>View project</w:t>
+        </w:r>
+      </w:hyperlink>
+    </w:p>
+    <w:p>
+      <w:pPr>
+        <w:spacing w:before="0" w:after="40" w:line="245" w:lineRule="auto"/>
+      </w:pPr>
+      <w:r>
+        <w:rPr>
+          <w:rFonts w:ascii="Arial" w:hAnsi="Arial"/>
+          <w:b/>
+          <w:sz w:val="18"/>
+        </w:rPr>
+        <w:t>Power BI | DAX | SQL</w:t>
       </w:r>
       <w:r>
         <w:rPr>
           <w:rFonts w:ascii="Arial" w:hAnsi="Arial"/>
           <w:b w:val="0"/>
-          <w:sz w:val="19"/>
+          <w:sz w:val="18"/>
         </w:rPr>
-        <w:t>Modeled acquisition cohorts and customer lifecycle states to identify drop-off points and support retention monitoring across analytics platforms.</w:t>
-      </w:r>
-    </w:p>
-    <w:p>
-      <w:pPr>
-        <w:spacing w:before="20" w:after="30" w:line="245" w:lineRule="auto"/>
-      </w:pPr>
-      <w:r>
-        <w:rPr>
-          <w:rFonts w:ascii="Arial" w:hAnsi="Arial"/>
-          <w:b/>
-          <w:sz w:val="19"/>
-        </w:rPr>
-        <w:t>Sales Performance &amp; Territory Analytics</w:t>
-      </w:r>
-      <w:r>
-        <w:rPr>
-          <w:rFonts w:ascii="Arial" w:hAnsi="Arial"/>
-          <w:b w:val="0"/>
-          <w:sz w:val="19"/>
-        </w:rPr>
-        <w:t xml:space="preserve"> | Power BI, DAX, SQL: </w:t>
-      </w:r>
-      <w:r>
-        <w:rPr>
-          <w:rFonts w:ascii="Arial" w:hAnsi="Arial"/>
-          <w:b w:val="0"/>
-          <w:sz w:val="19"/>
-        </w:rPr>
-        <w:t>Built a sales reporting model for YTD results, territory performance, customer investigation, and executive KPI review.</w:t>
+        <w:t xml:space="preserve">  |  YTD revenue, territory performance, customer investigation, and executive KPI reporting.</w:t>
       </w:r>
     </w:p>
     <w:sectPr>

</xml_diff>